<commit_message>
Mark CR-2026-XXX SRS v0.1 IN REVIEW and add SA review report
Re-rendered the SRS with status IN REVIEW (content unchanged) and added the
skmch-sa-srs-review pre-check: 3 Blocker, 7 Major, 6 Minor, 3 Observation.
Recommendation: Return to BA / client.

Co-Authored-By: Claude Opus 5.5 <noreply@anthropic.com>
Claude-Session: https://claude.ai/code/session_01SqQpfMDuNxnJsMrHmGWHSB
</commit_message>
<xml_diff>
--- a/docs/CR-2026-XXX/CR-2026-XXX_SRS_v0.1.docx
+++ b/docs/CR-2026-XXX/CR-2026-XXX_SRS_v0.1.docx
@@ -147,7 +147,7 @@
           </w:tcPr>
           <w:p>
             <w:r>
-              <w:t>DRAFT</w:t>
+              <w:t>IN REVIEW</w:t>
             </w:r>
           </w:p>
         </w:tc>
@@ -340,7 +340,7 @@
           </w:tcPr>
           <w:p>
             <w:r>
-              <w:t>Initial draft from MoM</w:t>
+              <w:t>Initial draft from MoM; submitted for SA review</w:t>
             </w:r>
           </w:p>
         </w:tc>
@@ -16882,7 +16882,7 @@
       <w:rPr>
         <w:sz w:val="16"/>
       </w:rPr>
-      <w:t>CONFIDENTIAL: SKMCH internal use only  |  Status: DRAFT</w:t>
+      <w:t>CONFIDENTIAL: SKMCH internal use only  |  Status: IN REVIEW</w:t>
     </w:r>
   </w:p>
 </w:ftr>

</xml_diff>